<commit_message>
docs: normalize GEP annex terminology
</commit_message>
<xml_diff>
--- a/docs/projects/haidian_gep_xuannv_implementation_and_acceptance_annex_20260729_zh.docx
+++ b/docs/projects/haidian_gep_xuannv_implementation_and_acceptance_annex_20260729_zh.docx
@@ -442,7 +442,7 @@
           <w:b w:val="0"/>
           <w:sz w:val="24"/>
         </w:rPr>
-        <w:t>构建海淀区10米月度生态证据层和三类调节服务的标准化核算原型，形成从多源数据对齐、embedding生成、生态服务实物量反演、价值量核算到可信问答的完整流程。</w:t>
+        <w:t>构建海淀区10米月度生态证据层和三类调节服务的标准化核算原型，形成从多源数据对齐、嵌入生成、生态服务实物量反演、价值量核算到可追溯核算辅助工具的完整流程。</w:t>
       </w:r>
     </w:p>
     <w:p>
@@ -633,7 +633,7 @@
           <w:b w:val="0"/>
           <w:sz w:val="24"/>
         </w:rPr>
-        <w:t>建立统一的10米分析网格和数据目录。10米网格是生态状态和embedding产品的表达网格，不意味着所有输入资料原始分辨率均为10米。每个产品必须标明其属性：原始观测、重采样辅助变量或模型推断结果。对于较粗的气象、土壤、DEM、统计和生态产品，保存原始空间分辨率、时间范围与重采样方法，避免把插值结果误表述为新增的10米观测事实。</w:t>
+        <w:t>建立统一的10米分析网格和数据目录。10米网格是生态状态和嵌入产品的表达网格，不意味着所有输入资料原始分辨率均为10米。每个产品必须标明其属性：原始观测、重采样辅助变量或模型推断结果。对于较粗的气象、土壤、DEM、统计和生态产品，保存原始空间分辨率、时间范围与重采样方法，避免把插值结果误表述为新增的10米观测事实。</w:t>
       </w:r>
     </w:p>
     <w:p>
@@ -991,7 +991,7 @@
           <w:b/>
           <w:sz w:val="24"/>
         </w:rPr>
-        <w:t>2. 关键技术二：月度地理embedding与生态服务实物量协同反演</w:t>
+        <w:t>2. 关键技术二：月度地理嵌入与生态服务实物量协同反演</w:t>
       </w:r>
     </w:p>
     <w:p>
@@ -1046,7 +1046,7 @@
           <w:b w:val="0"/>
           <w:sz w:val="24"/>
         </w:rPr>
-        <w:t>技术路线如下：多源月度影像与生态辅助数据 → 质量控制、时间匹配和10米网格对齐 → 玄女月度embedding与生态状态图 → 服务实物量模型与独立验证 → 标准化价值量核算 → 三类调节服务价值试点汇总、专题图和可信问答。完整GEP汇总仅作为全部适用科目条件满足后的扩展成果。</w:t>
+        <w:t>技术路线如下：多源月度影像与生态辅助数据 → 质量控制、时间匹配和10米网格对齐 → 玄女月度地理嵌入与生态状态图 → 服务实物量模型与独立验证 → 标准化价值量核算 → 三类调节服务价值试点汇总、专题图和可追溯核算辅助工具。完整GEP汇总仅作为全部适用科目条件满足后的扩展成果。</w:t>
       </w:r>
     </w:p>
     <w:p>
@@ -1086,7 +1086,7 @@
           <w:b w:val="0"/>
           <w:sz w:val="24"/>
         </w:rPr>
-        <w:t>将玄女稠密月度embedding作为生态状态证据层，服务于生态系统类型、植被、水体、不透水面和热环境等精细空间表达；同时保持GEP实物量和价值量核算遵循标准与过程模型，不混淆“表征分辨率”和“核算口径”。该项属于应用与工程创新，不把10米embedding误述为10米原始生态观测。</w:t>
+        <w:t>将玄女稠密月度地理嵌入作为生态状态证据层，服务于生态系统类型、植被、水体、不透水面和热环境等精细空间表达；同时保持GEP实物量和价值量核算遵循标准与过程模型，不混淆“表征分辨率”和“核算口径”。该项属于应用与工程创新，不把10米嵌入误述为10米原始生态观测。</w:t>
       </w:r>
     </w:p>
     <w:p>
@@ -1099,7 +1099,7 @@
           <w:b/>
           <w:sz w:val="24"/>
         </w:rPr>
-        <w:t>2. 面向生态过程的可复用embedding适配方式</w:t>
+        <w:t>2. 面向生态过程的可复用嵌入适配方式</w:t>
       </w:r>
     </w:p>
     <w:p>
@@ -1113,7 +1113,7 @@
           <w:b w:val="0"/>
           <w:sz w:val="24"/>
         </w:rPr>
-        <w:t>在通用多源遥感表征基础上，加入质量感知、地形和气象等生态辅助信息，研究“冻结底座＋生态适配器＋服务轻量头＋过程模型”的协同方式。通过与仅使用原始影像、仅使用embedding轻量头和全监督任务模型的对比及消融，检验生态适配器、质量信息和过程约束的实际贡献。</w:t>
+        <w:t>在通用多源遥感表征基础上，加入质量感知、地形和气象等生态辅助信息，研究“基础模型、生态适配器、服务轻量头和过程模型”协同方式。通过与仅使用原始影像、仅使用嵌入轻量头和全监督任务模型的对比分析，检验生态适配器、质量信息和过程约束的实际贡献。</w:t>
       </w:r>
     </w:p>
     <w:p>
@@ -1452,7 +1452,7 @@
           <w:b w:val="0"/>
           <w:sz w:val="24"/>
         </w:rPr>
-        <w:t>完成月度生态证据产品包、按目标月匹配的高分融合改造、生态分类与数据台账；研发固定二氧化碳、洪水调蓄和局部气候调节模块，完成原始影像、embedding和过程模型的对比及空间分块、时间留出验证。</w:t>
+        <w:t>完成月度生态证据产品包、按目标月匹配的高分融合改造、生态分类与数据台账；研发固定二氧化碳、洪水调蓄和局部气候调节模块，完成原始影像、嵌入和过程模型的对比及空间分块、时间留出验证。</w:t>
       </w:r>
     </w:p>
     <w:p>
@@ -1589,7 +1589,7 @@
           <w:b w:val="0"/>
           <w:sz w:val="24"/>
         </w:rPr>
-        <w:t>5. Xuannv项目长期记忆与生产模型卡：docs/agent_memory/haidian_embedding_project_memory.md；docs/production/haidian_model_card.md。</w:t>
+        <w:t>5. 玄女项目长期记忆与生产模型卡：docs/agent_memory/haidian_embedding_project_memory.md；docs/production/haidian_model_card.md。</w:t>
       </w:r>
     </w:p>
     <w:sectPr>

</xml_diff>

<commit_message>
docs: polish GEP annex language
</commit_message>
<xml_diff>
--- a/docs/projects/haidian_gep_xuannv_implementation_and_acceptance_annex_20260729_zh.docx
+++ b/docs/projects/haidian_gep_xuannv_implementation_and_acceptance_annex_20260729_zh.docx
@@ -566,7 +566,7 @@
           <w:b w:val="0"/>
           <w:sz w:val="24"/>
         </w:rPr>
-        <w:t>验收时，生态分类使用不少于5个空间分块的独立留出评价，并报告各类别用户精度、生产者精度、面积偏差、边界误差和置信区间；连续变量按服务类型报告R²、MAE、RMSE、偏差、生态系统类型差异和置信区间；洪水模块分别报告事件过程和年度水量闭合。每个产品必须覆盖经批准的基准年，并保留完整的数据血缘字段、缺失值编码、源数据许可、版本保留期和不可复现外部数据处置记录。每项服务均与预先登记的同口径传统基线和统一验证集比较，报告嵌入产品的差异、置信区间和消融结果，不预设必须优于基线的结论。</w:t>
+        <w:t>验收时，生态分类使用不少于5个空间分块的独立留出评价，并报告各类别用户精度、生产者精度、面积偏差、边界误差和置信区间；连续变量按服务类型报告R²、MAE、RMSE、偏差、生态系统类型差异和置信区间；洪水模块分别报告事件过程和年度水量闭合。每个产品必须覆盖经批准的基准年，并保留完整的数据血缘字段、缺失值编码、源数据许可、版本保留期和不可复现外部数据处置记录。每项服务均与预先登记的同口径传统基线和统一验证集比较，报告嵌入产品的差异、置信区间和对比分析结果，不预设必须优于基线的结论。</w:t>
       </w:r>
     </w:p>
     <w:p>
@@ -1222,7 +1222,7 @@
           <w:b w:val="0"/>
           <w:sz w:val="24"/>
         </w:rPr>
-        <w:t>4. 三类调节服务价值试点核算工具链和可信问答原型，提供数据查询、模型运行、结果制图、试点报告导出和审计记录能力。</w:t>
+        <w:t>4. 三类调节服务价值试点核算辅助工具，提供数据查询、模型运行、结果制图、试点报告导出和审计记录能力。</w:t>
       </w:r>
     </w:p>
     <w:p>

</xml_diff>

<commit_message>
docs: align GEP annex terminology and units
</commit_message>
<xml_diff>
--- a/docs/projects/haidian_gep_xuannv_implementation_and_acceptance_annex_20260729_zh.docx
+++ b/docs/projects/haidian_gep_xuannv_implementation_and_acceptance_annex_20260729_zh.docx
@@ -402,7 +402,7 @@
           <w:b w:val="0"/>
           <w:sz w:val="24"/>
         </w:rPr>
-        <w:t>项目已有玄女海淀月度嵌入基础作为起点。现有生产权重覆盖2025年12月至2026年5月、320个数据范围；对每个1,280米×1,280米数据范围输出128×128×64的名义10米等效分析网格。建筑、道路、水体结果使用与预训练开放地图弱语义同源的标签，属于内部制图验证，不作为生态服务或GEP核算精度依据。本项目将在此基础上补充DEM、气象、土壤、水文、地表温度、生态统计和监测资料，以生态过程模型和国家标准完成服务实物量及价值量试点核算。</w:t>
+        <w:t>项目已有玄女海淀月度嵌入基础作为起点。现有生产权重覆盖2025年12月至2026年5月、320个1,280米×1,280米样本单元；对每个样本单元输出128×128×64的名义10米等效分析网格。建筑、道路、水体结果使用与预训练开放地图弱语义同源的标签，属于内部制图验证，不作为生态服务或GEP核算精度依据。本项目将在此基础上补充数字高程模型（DEM）、气象、土壤、水文、地表温度、生态统计和监测资料，以生态过程模型和国家标准完成服务实物量及价值量试点核算。</w:t>
       </w:r>
     </w:p>
     <w:p>
@@ -661,7 +661,7 @@
           <w:b w:val="0"/>
           <w:sz w:val="24"/>
         </w:rPr>
-        <w:t>1. 月度观测层。包括Sentinel-1、Sentinel-2、Landsat、高分光学和高分SAR等影像及其云、阴影、缺失和质量掩膜。</w:t>
+        <w:t>1. 月度观测层。包括Sentinel-1、Sentinel-2、Landsat、高分光学和高分合成孔径雷达（SAR）等影像及其云、阴影、缺失和质量掩膜。</w:t>
       </w:r>
     </w:p>
     <w:p>
@@ -689,7 +689,7 @@
           <w:b w:val="0"/>
           <w:sz w:val="24"/>
         </w:rPr>
-        <w:t>3. 服务实物量层。包括NPP/生物量、蒸散发、降雨、辐射、气温、DEM、坡度、土壤、水文、水质、监测站和统计资料。该层用于模型校准与独立验证，不与最终测试资料混用。</w:t>
+        <w:t>3. 服务实物量层。包括净初级生产力（NPP）/生物量、蒸散发、降雨、辐射、气温、DEM、坡度、土壤、水文、水质、监测站和统计资料。该层用于模型校准与独立验证，不与最终测试资料混用。</w:t>
       </w:r>
     </w:p>
     <w:p>
@@ -771,7 +771,7 @@
           <w:b/>
           <w:sz w:val="24"/>
         </w:rPr>
-        <w:t>3. GEP反演与问答智能体构建</w:t>
+        <w:t>3. 三类调节服务核算与受约束查询工具构建</w:t>
       </w:r>
     </w:p>
     <w:p>
@@ -813,7 +813,7 @@
           <w:b w:val="0"/>
           <w:sz w:val="24"/>
         </w:rPr>
-        <w:t>1. 固碳服务模块。实物量口径为固定二氧化碳量（tCO2/a）。以嵌入产品辅助植被类型、面积和空间分配，不把NPP直接等同于净碳汇。方法按GB/T 46869—2025附录A.7的优先顺序选用：具备相邻年份清查/复测资料时采用生物量法；具备长期本地参数时采用固碳速率法；具备异养呼吸或NPP—NEP转换资料时采用NEP法。各生态系统类型预先锁定一种主核算路径和相应的年度增量、年通量或长期速率独立验证对象；仅验证NPP或生物量时，不发布年度固定二氧化碳价值量。价值参数明确碳价或替代成本、适用年份、折算方法和版本。</w:t>
+        <w:t>1. 固碳服务模块。实物量口径为固定二氧化碳量（tCO2/a）。以嵌入产品辅助植被类型、面积和空间分配，不把NPP直接等同于净碳汇。方法按GB/T 46869—2025附录A.7的优先顺序选用：具备相邻年份清查/复测资料时采用生物量法；具备长期本地参数时采用固碳速率法；具备异养呼吸或NPP—净生态系统生产力（NEP）转换资料时采用NEP法。各生态系统类型预先锁定一种主核算路径和相应的年度增量、年通量或长期速率独立验证对象；仅验证NPP或生物量时，不发布年度固定二氧化碳价值量。价值参数明确碳价或替代成本、适用年份、折算方法和版本。</w:t>
       </w:r>
     </w:p>
     <w:p>
@@ -1126,7 +1126,7 @@
           <w:b/>
           <w:sz w:val="24"/>
         </w:rPr>
-        <w:t>3. 面向核算审计的可信智能体</w:t>
+        <w:t>3. 面向核算审计的受约束查询与核算工具</w:t>
       </w:r>
     </w:p>
     <w:p>
@@ -1358,7 +1358,7 @@
           <w:b w:val="0"/>
           <w:sz w:val="24"/>
         </w:rPr>
-        <w:t>玄女海淀现有生产模型已形成月度多源遥感嵌入能力：输入由Sentinel-2、Sentinel-1、Landsat、高分光学和高分SAR等组成；在2025年12月至2026年5月、320个数据范围内输出128×128×64的名义10米等效分析网格。现有建筑、道路、水体结果使用与预训练开放地图弱语义同源的二值标签，属于同源弱标签下的内部可分性和快速制图验证；其只能说明模型对这些开放地图定义类别具有可用表征，不构成独立人工真值、生态状态分类、生态服务反演或GEP核算精度的证据。</w:t>
+        <w:t>玄女海淀现有生产模型已形成月度多源遥感嵌入能力：输入由Sentinel-2、Sentinel-1、Landsat、高分光学和高分SAR等组成；在2025年12月至2026年5月、320个1,280米×1,280米样本单元内输出128×128×64的名义10米等效分析网格。现有建筑、道路、水体结果使用与预训练开放地图弱语义同源的二值标签，属于同源弱标签下的内部可分性和快速制图验证；其只能说明模型对这些开放地图定义类别具有可用表征，不构成独立人工真值、生态状态分类、生态服务反演或GEP核算精度的证据。</w:t>
       </w:r>
     </w:p>
     <w:p>

</xml_diff>

<commit_message>
docs: unify GEP annex sample-unit terminology
</commit_message>
<xml_diff>
--- a/docs/projects/haidian_gep_xuannv_implementation_and_acceptance_annex_20260729_zh.docx
+++ b/docs/projects/haidian_gep_xuannv_implementation_and_acceptance_annex_20260729_zh.docx
@@ -308,7 +308,7 @@
           <w:b w:val="0"/>
           <w:sz w:val="24"/>
         </w:rPr>
-        <w:t>本附件说明海淀区三类调节服务价值试点的实施与验收要求。玄女以1,280米×1,280米范围组织训练，每个数据范围输出128×128×64稠密嵌入，以名义10米等效分析网格表达地表状态；该网格用于面积、覆盖比例和空间分配，不代表10米生态过程观测或过程核算精度。固定二氧化碳、洪水调蓄和局部气候调节的实物量与价值量由国家标准方法、生态过程模型、监测资料、统计资料和价格参数共同核算。</w:t>
+        <w:t>本附件说明海淀区三类调节服务价值试点的实施与验收要求。玄女以1,280米×1,280米样本单元组织训练，每个样本单元输出128×128×64稠密嵌入，以名义10米等效分析网格表达地表状态；该网格用于面积、覆盖比例和空间分配，不代表10米生态过程观测或过程核算精度。固定二氧化碳、洪水调蓄和局部气候调节的实物量与价值量由国家标准方法、生态过程模型、监测资料、统计资料和价格参数共同核算。</w:t>
       </w:r>
     </w:p>
     <w:p>
@@ -758,7 +758,7 @@
           <w:b w:val="0"/>
           <w:sz w:val="24"/>
         </w:rPr>
-        <w:t>现有生产模型导出结果为嵌入及其全局元数据，不直接输出逐数据范围、逐月质量信息或生态状态图；现有高分源采用跨可用时相汇聚后逐月重复融合，不属于目标月同期高分观测。项目拟将单帧高分输入改造为按目标月组织的时序高分输入与掩膜，并重新训练、导出和验证，现有权重不能通过后处理直接获得该能力。项目启动时冻结质量数据字典，区分观测质量与模型不确定性，记录逐源云、阴影、无数据掩膜、获取日期、目标月时间差、可用性、降级原因、重采样方法和月产品有效标志；模型不确定性另行说明计算方法、校准资料和适用范围。</w:t>
+        <w:t>现有生产模型导出结果为嵌入及其全局元数据，不直接输出逐样本单元、逐月质量信息或生态状态图；现有高分源采用跨可用时相汇聚后逐月重复融合，不属于目标月同期高分观测。项目拟将单帧高分输入改造为按目标月组织的时序高分输入与掩膜，并重新训练、导出和验证，现有权重不能通过后处理直接获得该能力。项目启动时冻结质量数据字典，区分观测质量与模型不确定性，记录逐源云、阴影、无数据掩膜、获取日期、目标月时间差、可用性、降级原因、重采样方法和月产品有效标志；模型不确定性另行说明计算方法、校准资料和适用范围。</w:t>
       </w:r>
     </w:p>
     <w:p>
@@ -1180,7 +1180,7 @@
           <w:b w:val="0"/>
           <w:sz w:val="24"/>
         </w:rPr>
-        <w:t>1. 海淀区名义10米等效分析网格的月度地表状态产品和数据字典，包括嵌入、质量掩膜、生态状态图和数据血缘信息。现有生产结果作为基线；逐数据范围、逐月质量元数据和生态状态图为本项目新增交付。</w:t>
+        <w:t>1. 海淀区名义10米等效分析网格的月度地表状态产品和数据字典，包括嵌入、质量掩膜、生态状态图和数据血缘信息。现有生产结果作为基线；逐样本单元、逐月质量元数据和生态状态图为本项目新增交付。</w:t>
       </w:r>
     </w:p>
     <w:p>

</xml_diff>